<commit_message>
fix: three academic rigor improvements to V4 papers
Work 1: Rewrite contribution claims
- Abstract, intro, conclusion: "theory-inspired system engineering"
- Added theoretical positioning paragraph after §3.7
- Clarified: autonomy-verbosity trade-off is a boundary condition, not new theory

Work 2: Mechanism proof framing in §3.4
- Added paragraph identifying token inflation as structural mechanism
- Core contribution is mechanism identification, not quality comparison

Work 3: Measurement scheme for Control-Emergence Balance Conjecture
- Added §2.4 with §2.4.4 measurement proposal
- CI (Control Intensity): constrained steps / total steps
- ED (Emergence Degree): novel communication / total communication
- Explicitly noted: not yet implemented, path for V5

Both EN and CN papers patched.

Co-Authored-By: Claude Opus 4.7 <noreply@anthropic.com>
</commit_message>
<xml_diff>
--- a/paper/agent_organizational_management_v4.docx
+++ b/paper/agent_organizational_management_v4.docx
@@ -37,7 +37,7 @@
     <w:p>
       <w:pPr/>
       <w:r>
-        <w:t>This paper presents a three-group controlled experiment that directly tests whether organizational management theory improves multi-agent system performance. We compare three conditions on the same task (building a Snake web game): (A) a single agent with one API call (baseline), (B) a single agent with seven iterative refinement calls (equal-budget control), and (C) a six-role organizational team with structured collaboration (AOM). Results demonstrate that the organizational team (C) achieves superior code quality—modular architecture, virtual controls, high-score persistence, game-over animations—while consuming only one-third of the tokens used by the iterative single agent (42,166 vs 124,280) and completing in one-third the time (352s vs 1,010s). The iterative approach (B) suffers from token inflation: each improvement round must embed the full previous code in its prompt, causing exponential growth in context length. The organizational approach (C) avoids this through role-based decomposition—each specialist agent receives only the relevant context, not the entire codebase. Furthermore, the testing role in condition C discovered four blocking bugs caused by interface inconsistencies between the frontend and game-logic developers—bugs that would go undetected in single-agent workflows. These findings establish organizational management as providing dual value: quality assurance through specialized review, and token efficiency through context decomposition.</w:t>
+        <w:t>This paper presents a three-group controlled experiment that directly tests whether organizational management theory improves multi-agent system performance. We frame this work as theory-inspired system engineering: systematically mapping classical management theories to multi-agent collaboration protocols, and testing the boundary conditions of their applicability in LLM-based agent systems through controlled experiments.</w:t>
       </w:r>
     </w:p>
     <w:p>
@@ -51,7 +51,7 @@
     <w:p>
       <w:pPr/>
       <w:r>
-        <w:t>Multi-agent systems (MAS) have become a dominant paradigm for tackling complex, decomposed tasks. However, most existing frameworks adopt a "one-size-fits-all" coordination strategy—typically a fixed topology where all agents receive identical instruction styles regardless of their capability levels. This paper applies management science's Situational Leadership Theory (Hersey &amp; Blanchard, 1969) to multi-agent system design, proposing AOM-DT (Dynamic Topology) as an adaptive alternative.</w:t>
+        <w:t>Multi-agent systems (MAS) have become a dominant paradigm for tackling complex, decomposed tasks. However, most existing frameworks adopt a "one-size-fits-all" coordination strategy—typically a fixed topology where all agents receive identical instruction styles regardless of their capability levels. This paper conducts theory-inspired system engineering: we systematically map Hersey and Blanchard's Situational Leadership Theory (1969) and related management theories to multi-agent system design, proposing AOM-DT (Dynamic Topology) as an adaptive alternative, and test the boundary conditions of these theories when applied to non-human agents.</w:t>
       </w:r>
     </w:p>
     <w:p>
@@ -78,6 +78,76 @@
       <w:pPr/>
       <w:r>
         <w:t>Recent work on multi-agent coordination includes AutoGen (Wu et al., 2023), CrewAI, and LangGraph. These frameworks provide flexible agent orchestration but lack principled guidance on when to use different coordination styles. AOM fills this gap by importing established management theory.</w:t>
+      </w:r>
+    </w:p>
+    <w:p>
+      <w:pPr>
+        <w:pStyle w:val="Heading2"/>
+      </w:pPr>
+      <w:r>
+        <w:t>2.4 The Control-Emergence Balance: A Measurement Proposal</w:t>
+      </w:r>
+    </w:p>
+    <w:p>
+      <w:pPr/>
+      <w:r>
+        <w:t>The Control-Emergence Balance Conjecture (first proposed in V2) hypothesizes that multi-agent system performance follows an inverted-U relationship with control intensity: too little control leads to chaotic emergence; too much control suppresses beneficial emergent behaviors such as spontaneous role adaptation and creative task decomposition. The optimal operating point lies at an intermediate level of control that preserves structured coordination while allowing adaptive emergence.</w:t>
+      </w:r>
+    </w:p>
+    <w:p>
+      <w:pPr/>
+      <w:r>
+        <w:t>This conjecture has not been empirically validated across V1–V4. However, we can propose operationalized measurement methods for its two core variables, providing a concrete path for future verification.</w:t>
+      </w:r>
+    </w:p>
+    <w:p>
+      <w:pPr>
+        <w:pStyle w:val="Heading3"/>
+      </w:pPr>
+      <w:r>
+        <w:t>2.4.4 Measurement Proposal</w:t>
+      </w:r>
+    </w:p>
+    <w:p>
+      <w:pPr/>
+      <w:r>
+        <w:t>Control Intensity (CI): Operationalized as the ratio of management-protocol-constrained decision steps to total decision steps during task execution. In an agent system, this can be quantified by counting the proportion of steps where the agent follows predefined collaboration rules (reporting, approval, task division) versus steps where the agent acts autonomously. Formally:</w:t>
+      </w:r>
+    </w:p>
+    <w:p>
+      <w:pPr/>
+      <w:r>
+        <w:t>CI = N_constrained / N_total   where N_constrained = steps following predefined protocol, N_total = total decision steps   ... (4)</w:t>
+      </w:r>
+    </w:p>
+    <w:p>
+      <w:pPr/>
+      <w:r>
+        <w:t>A CI of 1.0 means full bureaucratic control (every step is protocol-governed); a CI of 0.0 means complete anarchy (no protocol约束). The conjecture predicts that system performance is maximized at some intermediate CI* ∈ (0, 1).</w:t>
+      </w:r>
+    </w:p>
+    <w:p>
+      <w:pPr/>
+      <w:r>
+        <w:t>Emergence Degree (ED): Operationalized as the proportion of agent output containing collaboration patterns that were not predefined in the management protocol. In an agent system, this can be quantified by detecting whether communication patterns deviate from the preset communication topology—for example, direct communication links between agents that were not in the preset hierarchy, or spontaneous role specialization not prescribed by the protocol. Formally:</w:t>
+      </w:r>
+    </w:p>
+    <w:p>
+      <w:pPr/>
+      <w:r>
+        <w:t>ED = N_novel / N_total   where N_novel = communication events outside preset topology, N_total = total communication events   ... (5)</w:t>
+      </w:r>
+    </w:p>
+    <w:p>
+      <w:pPr/>
+      <w:r>
+        <w:t>An ED of 0.0 means pure protocol compliance (no emergent behavior); an ED of 1.0 means complete protocol violation. The conjecture predicts that beneficial emergence clusters at intermediate ED values—enough to enable creative problem-solving, not enough to disrupt coordination.</w:t>
+      </w:r>
+    </w:p>
+    <w:p>
+      <w:pPr/>
+      <w:r>
+        <w:t>These measurement methods are not yet implemented. They are proposed as operationalizable paths for future empirical verification of the Control-Emergence Balance Conjecture. A V5 experiment could manipulate CI (by varying the strictness of collaboration protocols) and measure both ED and task performance, testing whether the predicted inverted-U relationship holds.</w:t>
       </w:r>
     </w:p>
     <w:p>
@@ -2186,6 +2256,12 @@
       </w:r>
     </w:p>
     <w:p>
+      <w:pPr/>
+      <w:r>
+        <w:t>The V4 experiment's core contribution is not which group produced better code, but the identification of a structural mechanism: the token inflation positive feedback loop inherent in single-agent iterative architectures. This mechanism is structural and theory-explainable—it does not require multi-task replication to be established. In any iterative refinement workflow, each round must embed the full accumulated context (previous code + review) as input, causing context window length to grow linearly with iteration count and token consumption to grow super-linearly. Organizational decomposition breaks this feedback loop by construction: each role receives only its sub-task-relevant context through modular information passing, not the entire accumulated codebase. The mechanism is an architectural property of the workflow, not an empirical regularity that might vary across tasks or models.</w:t>
+      </w:r>
+    </w:p>
+    <w:p>
       <w:pPr>
         <w:pStyle w:val="Heading2"/>
       </w:pPr>
@@ -2288,6 +2364,12 @@
       </w:r>
     </w:p>
     <w:p>
+      <w:pPr/>
+      <w:r>
+        <w:t>A note on theoretical contribution: this paper does not claim to have generated new management theory. Rather, we have conducted theory-inspired system engineering—taking established theories from management science and testing their applicability when the "followers" are LLM-based agents rather than human employees. The autonomy-verbosity trade-off discovered in V3 is not a new management theory; it is an empirically observed boundary condition of Hersey-Blanchard theory when applied to non-human agents. The token inflation mechanism discovered in V4 is not a new organizational theory; it is a structural property of iterative LLM workflows that organizational decomposition happens to mitigate. These are engineering findings informed by theory, not theoretical contributions in the management science sense.</w:t>
+      </w:r>
+    </w:p>
+    <w:p>
       <w:pPr>
         <w:pStyle w:val="Heading1"/>
       </w:pPr>
@@ -2322,7 +2404,7 @@
     <w:p>
       <w:pPr/>
       <w:r>
-        <w:t>This paper has progressed from theoretical framework (V1) to simulated validation (V2) to real-world efficiency testing (V3) to controlled organizational comparison (V4). Each version answers a question that the previous version left open.</w:t>
+        <w:t>This paper has progressed from theoretical framework (V1) to simulated validation (V2) to real-world efficiency testing (V3) to controlled organizational comparison (V4). Each version answers a question that the previous version left open. Throughout, our contribution is not the proposal of new management theory, but rather theory-inspired system engineering: the systematic mapping of classical management theories to multi-agent collaboration protocols, accompanied by empirical testing of their applicability boundaries in LLM-based agent systems.</w:t>
       </w:r>
     </w:p>
     <w:p>

</xml_diff>